<commit_message>
docs: add comprehensive 1-page signoff sheet lenin.md and update docx
</commit_message>
<xml_diff>
--- a/CIS046-3_Week8_SignOff_Form_Concise.docx
+++ b/CIS046-3_Week8_SignOff_Form_Concise.docx
@@ -13,14 +13,14 @@
           <w:b/>
           <w:i w:val="0"/>
           <w:color w:val="102C57"/>
-          <w:sz w:val="23"/>
+          <w:sz w:val="22"/>
         </w:rPr>
-        <w:t>CIS046-3: Software for Enterprise (AY 26/27) — Week 8 Sign-Off Sheet</w:t>
+        <w:t>CIS046-3: Software for Enterprise (AY 26/27) — Week 8 Formal Sign-Off Sheet</w:t>
       </w:r>
     </w:p>
     <w:p>
       <w:pPr>
-        <w:spacing w:before="0" w:after="60"/>
+        <w:spacing w:before="0" w:after="50"/>
         <w:jc w:val="center"/>
       </w:pPr>
       <w:r>
@@ -29,7 +29,7 @@
           <w:b/>
           <w:i w:val="0"/>
           <w:color w:val="191919"/>
-          <w:sz w:val="16"/>
+          <w:sz w:val="15"/>
         </w:rPr>
         <w:t xml:space="preserve">Student Name: </w:t>
       </w:r>
@@ -39,9 +39,9 @@
           <w:b w:val="0"/>
           <w:i w:val="0"/>
           <w:color w:val="191919"/>
-          <w:sz w:val="16"/>
+          <w:sz w:val="15"/>
         </w:rPr>
-        <w:t>[Your Name]   |   Student ID: [Your ID]   |   Date: November 2026   |   Sign: ________________________</w:t>
+        <w:t>Lenin Maharjan   |   Student ID: [Your ID]   |   Date: November 2026   |   Sign: ________________________</w:t>
         <w:br/>
       </w:r>
       <w:r>
@@ -50,7 +50,7 @@
           <w:b/>
           <w:i w:val="0"/>
           <w:color w:val="191919"/>
-          <w:sz w:val="16"/>
+          <w:sz w:val="15"/>
         </w:rPr>
         <w:t xml:space="preserve">Project: </w:t>
       </w:r>
@@ -60,7 +60,7 @@
           <w:b w:val="0"/>
           <w:i w:val="0"/>
           <w:color w:val="191919"/>
-          <w:sz w:val="16"/>
+          <w:sz w:val="15"/>
         </w:rPr>
         <w:t xml:space="preserve">Banana Quest: 90s Retro Arcade Edition   |   Repo: </w:t>
       </w:r>
@@ -70,7 +70,7 @@
           <w:b w:val="0"/>
           <w:i/>
           <w:color w:val="191919"/>
-          <w:sz w:val="16"/>
+          <w:sz w:val="15"/>
         </w:rPr>
         <w:t xml:space="preserve">github.com/lenin-maharjan/bananaAPI_Quest   |   </w:t>
       </w:r>
@@ -80,14 +80,14 @@
           <w:b w:val="0"/>
           <w:i w:val="0"/>
           <w:color w:val="191919"/>
-          <w:sz w:val="16"/>
+          <w:sz w:val="15"/>
         </w:rPr>
         <w:t>Stack: Node.js, Express, SQLite, ES6 Modules</w:t>
       </w:r>
     </w:p>
     <w:p>
       <w:pPr>
-        <w:spacing w:before="60" w:after="20" w:line="240" w:lineRule="auto"/>
+        <w:spacing w:before="50" w:after="10" w:line="240" w:lineRule="auto"/>
       </w:pPr>
       <w:r>
         <w:rPr>
@@ -95,9 +95,9 @@
           <w:b/>
           <w:i w:val="0"/>
           <w:color w:val="102C57"/>
-          <w:sz w:val="17"/>
+          <w:sz w:val="16"/>
         </w:rPr>
-        <w:t>1. VERSION CONTROL</w:t>
+        <w:t>1. VERSION CONTROL &amp; ARCHITECTURAL EVOLUTION</w:t>
       </w:r>
       <w:r>
         <w:rPr>
@@ -105,7 +105,7 @@
           <w:b w:val="0"/>
           <w:i/>
           <w:color w:val="5A5A5A"/>
-          <w:sz w:val="15"/>
+          <w:sz w:val="14"/>
         </w:rPr>
         <w:t xml:space="preserve">  —  Q: How did you develop your code (features added after v1.0)?</w:t>
       </w:r>
@@ -114,7 +114,7 @@
       <w:pPr>
         <w:pStyle w:val="ListBullet"/>
         <w:spacing w:before="10" w:after="20" w:line="245" w:lineRule="auto"/>
-        <w:ind w:left="288"/>
+        <w:ind w:left="259"/>
       </w:pPr>
       <w:r>
         <w:rPr>
@@ -122,9 +122,9 @@
           <w:b/>
           <w:i w:val="0"/>
           <w:color w:val="191919"/>
-          <w:sz w:val="15"/>
+          <w:sz w:val="14"/>
         </w:rPr>
-        <w:t xml:space="preserve">Enterprise Git Flow &amp; Feature Branching: </w:t>
+        <w:t xml:space="preserve">Enterprise Git Flow &amp; Atomic Branching: </w:t>
       </w:r>
       <w:r>
         <w:rPr>
@@ -132,16 +132,16 @@
           <w:b w:val="0"/>
           <w:i w:val="0"/>
           <w:color w:val="191919"/>
-          <w:sz w:val="15"/>
+          <w:sz w:val="14"/>
         </w:rPr>
-        <w:t>Developed across isolated branches (feature/fullstack-modular-refactor, feature/settings-and-instant-prefetch, feature/90s-arcade-cabinet) integrated via atomic conventional commits into main.</w:t>
+        <w:t>Engineered systematically across isolated feature branches (feature/architecture-refactor, feature/robust-identity-sqlite, feature/api-fallback-cache, feature/settings-and-instant-prefetch, feature/fullstack-modular-refactor), merging atomically into main with conventional commits and zero working-tree pollution (.gitignore excludes database.sqlite, node_modules/, and logs).</w:t>
       </w:r>
     </w:p>
     <w:p>
       <w:pPr>
         <w:pStyle w:val="ListBullet"/>
         <w:spacing w:before="10" w:after="20" w:line="245" w:lineRule="auto"/>
-        <w:ind w:left="288"/>
+        <w:ind w:left="259"/>
       </w:pPr>
       <w:r>
         <w:rPr>
@@ -149,9 +149,9 @@
           <w:b/>
           <w:i w:val="0"/>
           <w:color w:val="191919"/>
-          <w:sz w:val="15"/>
+          <w:sz w:val="14"/>
         </w:rPr>
-        <w:t xml:space="preserve">Separation of Concerns (SoC) &amp; Service Layer: </w:t>
+        <w:t xml:space="preserve">Multi-Tier Backend (MVC + Service Layer): </w:t>
       </w:r>
       <w:r>
         <w:rPr>
@@ -159,16 +159,16 @@
           <w:b w:val="0"/>
           <w:i w:val="0"/>
           <w:color w:val="191919"/>
-          <w:sz w:val="15"/>
+          <w:sz w:val="14"/>
         </w:rPr>
-        <w:t>Refactored monoliths into clean multi-tier layers: Backend Service Layer (src/services/puzzleService.js) isolating business logic from thin HTTP controllers (bananaController.js), a Config layer (fallbackPuzzles.js), and SQLite models (db.js).</w:t>
+        <w:t>Decoupled server into specialized layers: a dedicated Service Layer (src/services/puzzleService.js) managing background workers, caching queues, and failover logic; a Config Layer (src/config/fallbackPuzzles.js) storing 12 disaster-recovery assets; thin HTTP controllers (bananaController.js, authController.js); and SQLite relational models (src/models/db.js).</w:t>
       </w:r>
     </w:p>
     <w:p>
       <w:pPr>
         <w:pStyle w:val="ListBullet"/>
         <w:spacing w:before="10" w:after="20" w:line="245" w:lineRule="auto"/>
-        <w:ind w:left="288"/>
+        <w:ind w:left="259"/>
       </w:pPr>
       <w:r>
         <w:rPr>
@@ -176,9 +176,9 @@
           <w:b/>
           <w:i w:val="0"/>
           <w:color w:val="191919"/>
-          <w:sz w:val="15"/>
+          <w:sz w:val="14"/>
         </w:rPr>
-        <w:t xml:space="preserve">Frontend ES6 Modularization: </w:t>
+        <w:t xml:space="preserve">Frontend ES6 Modularization (Separation of Concerns): </w:t>
       </w:r>
       <w:r>
         <w:rPr>
@@ -186,41 +186,14 @@
           <w:b w:val="0"/>
           <w:i w:val="0"/>
           <w:color w:val="191919"/>
-          <w:sz w:val="15"/>
+          <w:sz w:val="14"/>
         </w:rPr>
-        <w:t>Partitioned client-side concerns into native ES6 modules (&lt;script type="module"&gt;): audio.js (Web Audio synth), terminal.js (diagnostics), api.js (REST client), and ui.js (DOM mutations), orchestrated by a lean app.js entry point.</w:t>
+        <w:t>Eliminated client monoliths using native ES6 modules (&lt;script type="module"&gt;), partitioning presentation into single-responsibility domains: audio.js (Web Audio synth), terminal.js (diagnostics), api.js (REST client), ui.js (DOM mutations/HUD), and app.js (orchestrator).</w:t>
       </w:r>
     </w:p>
     <w:p>
       <w:pPr>
-        <w:pStyle w:val="ListBullet"/>
-        <w:spacing w:before="10" w:after="20" w:line="245" w:lineRule="auto"/>
-        <w:ind w:left="288"/>
-      </w:pPr>
-      <w:r>
-        <w:rPr>
-          <w:rFonts w:ascii="Calibri" w:hAnsi="Calibri"/>
-          <w:b/>
-          <w:i w:val="0"/>
-          <w:color w:val="191919"/>
-          <w:sz w:val="15"/>
-        </w:rPr>
-        <w:t xml:space="preserve">Strict Repository Hygiene: </w:t>
-      </w:r>
-      <w:r>
-        <w:rPr>
-          <w:rFonts w:ascii="Calibri" w:hAnsi="Calibri"/>
-          <w:b w:val="0"/>
-          <w:i w:val="0"/>
-          <w:color w:val="191919"/>
-          <w:sz w:val="15"/>
-        </w:rPr>
-        <w:t>Enforced thorough .gitignore rules excluding SQLite database binaries (database.sqlite), vendor dependencies (node_modules/), runtime logs, and cache artifacts to guarantee pristine build environments.</w:t>
-      </w:r>
-    </w:p>
-    <w:p>
-      <w:pPr>
-        <w:spacing w:before="60" w:after="20" w:line="240" w:lineRule="auto"/>
+        <w:spacing w:before="50" w:after="10" w:line="240" w:lineRule="auto"/>
       </w:pPr>
       <w:r>
         <w:rPr>
@@ -228,9 +201,9 @@
           <w:b/>
           <w:i w:val="0"/>
           <w:color w:val="102C57"/>
-          <w:sz w:val="17"/>
+          <w:sz w:val="16"/>
         </w:rPr>
-        <w:t>2. EVENT-DRIVEN ARCHITECTURES</w:t>
+        <w:t>2. EVENT-DRIVEN ARCHITECTURES (EDA)</w:t>
       </w:r>
       <w:r>
         <w:rPr>
@@ -238,7 +211,7 @@
           <w:b w:val="0"/>
           <w:i/>
           <w:color w:val="5A5A5A"/>
-          <w:sz w:val="15"/>
+          <w:sz w:val="14"/>
         </w:rPr>
         <w:t xml:space="preserve">  —  Q: What in your code triggers events (GUI, buttons, timeouts)?</w:t>
       </w:r>
@@ -247,7 +220,7 @@
       <w:pPr>
         <w:pStyle w:val="ListBullet"/>
         <w:spacing w:before="10" w:after="20" w:line="245" w:lineRule="auto"/>
-        <w:ind w:left="288"/>
+        <w:ind w:left="259"/>
       </w:pPr>
       <w:r>
         <w:rPr>
@@ -255,7 +228,7 @@
           <w:b/>
           <w:i w:val="0"/>
           <w:color w:val="191919"/>
-          <w:sz w:val="15"/>
+          <w:sz w:val="14"/>
         </w:rPr>
         <w:t xml:space="preserve">Decoupled Pub/Sub Architecture (window.dispatchEvent): </w:t>
       </w:r>
@@ -265,16 +238,16 @@
           <w:b w:val="0"/>
           <w:i w:val="0"/>
           <w:color w:val="191919"/>
-          <w:sz w:val="15"/>
+          <w:sz w:val="14"/>
         </w:rPr>
-        <w:t>Components communicate asynchronously via a CustomEvent bus (auth-success, puzzle-loaded, guess-evaluated, streak-updated, score-saved, game-over), eliminating tight coupling between UI presentation and business logic.</w:t>
+        <w:t>Domain modules communicate purely asynchronously through an in-browser CustomEvent bus (auth-success, puzzle-loaded, guess-evaluated, streak-updated, score-saved, game-over, sfx-toggled, settings-updated), eliminating direct DOM and component coupling.</w:t>
       </w:r>
     </w:p>
     <w:p>
       <w:pPr>
         <w:pStyle w:val="ListBullet"/>
         <w:spacing w:before="10" w:after="20" w:line="245" w:lineRule="auto"/>
-        <w:ind w:left="288"/>
+        <w:ind w:left="259"/>
       </w:pPr>
       <w:r>
         <w:rPr>
@@ -282,9 +255,9 @@
           <w:b/>
           <w:i w:val="0"/>
           <w:color w:val="191919"/>
-          <w:sz w:val="15"/>
+          <w:sz w:val="14"/>
         </w:rPr>
-        <w:t xml:space="preserve">Non-Blocking Asynchronous Recovery: </w:t>
+        <w:t xml:space="preserve">Non-Blocking Asynchronous Error Recovery: </w:t>
       </w:r>
       <w:r>
         <w:rPr>
@@ -292,16 +265,16 @@
           <w:b w:val="0"/>
           <w:i w:val="0"/>
           <w:color w:val="191919"/>
-          <w:sz w:val="15"/>
+          <w:sz w:val="14"/>
         </w:rPr>
-        <w:t>Runtime faults and wrong guesses trigger a non-blocking 3-second recovery delay (setTimeout(() =&gt; loadPuzzle(), 3000)), pausing game timers and disabling inputs to prevent race conditions and input spamming while auto-advancing.</w:t>
+        <w:t>Runtime faults and wrong guesses initiate a non-blocking 3-second self-healing interval (setTimeout(() =&gt; loadPuzzle(), 3000)), halting countdown timers and disabling inputs to prevent race conditions and input spamming while auto-advancing rounds.</w:t>
       </w:r>
     </w:p>
     <w:p>
       <w:pPr>
         <w:pStyle w:val="ListBullet"/>
         <w:spacing w:before="10" w:after="20" w:line="245" w:lineRule="auto"/>
-        <w:ind w:left="288"/>
+        <w:ind w:left="259"/>
       </w:pPr>
       <w:r>
         <w:rPr>
@@ -309,7 +282,7 @@
           <w:b/>
           <w:i w:val="0"/>
           <w:color w:val="191919"/>
-          <w:sz w:val="15"/>
+          <w:sz w:val="14"/>
         </w:rPr>
         <w:t xml:space="preserve">Dual-Stream Observer Pattern Diagnostics: </w:t>
       </w:r>
@@ -319,16 +292,16 @@
           <w:b w:val="0"/>
           <w:i w:val="0"/>
           <w:color w:val="191919"/>
-          <w:sz w:val="15"/>
+          <w:sz w:val="14"/>
         </w:rPr>
-        <w:t>Real-time MS-DOS diagnostic console split into an Event Bus observer stream (logToEventStream -&gt; EVENT_BUS.EXE) and an automated fault interceptor (logToErrorStream -&gt; ERROR_LOG.DAT) capturing HTTP drops, countdown timeouts, and exception traces.</w:t>
+        <w:t>Real-time MS-DOS diagnostic console split into an Event Bus observer stream (logToEventStream -&gt; EVENT_BUS.EXE) and an automated fault interceptor (logToErrorStream -&gt; ERROR_LOG.DAT) capturing network drops, timeouts, and wrong answers with millisecond timestamps (HH:MM:SS.mmm).</w:t>
       </w:r>
     </w:p>
     <w:p>
       <w:pPr>
         <w:pStyle w:val="ListBullet"/>
         <w:spacing w:before="10" w:after="20" w:line="245" w:lineRule="auto"/>
-        <w:ind w:left="288"/>
+        <w:ind w:left="259"/>
       </w:pPr>
       <w:r>
         <w:rPr>
@@ -336,7 +309,7 @@
           <w:b/>
           <w:i w:val="0"/>
           <w:color w:val="191919"/>
-          <w:sz w:val="15"/>
+          <w:sz w:val="14"/>
         </w:rPr>
         <w:t xml:space="preserve">Hardware Interrupts &amp; Procedural Web Audio Synth: </w:t>
       </w:r>
@@ -346,14 +319,14 @@
           <w:b w:val="0"/>
           <w:i w:val="0"/>
           <w:color w:val="191919"/>
-          <w:sz w:val="15"/>
+          <w:sz w:val="14"/>
         </w:rPr>
-        <w:t>Captures physical keyboard interrupts (keypad 0-9 auto-submit, 'F' outage toggle) and temporal intervals (setInterval 1s countdown with panic mode thresholding); procedurally synthesizes dynamic 8-bit sound waveforms via AudioContext.</w:t>
+        <w:t>Captures physical keyboard interrupts (keypad 0-9 auto-submit, 'F' outage toggle) and temporal intervals (setInterval 1s countdown with &lt;10s panic mode thresholding); procedurally synthesizes dynamic 8-bit sound waveforms via AudioContext.</w:t>
       </w:r>
     </w:p>
     <w:p>
       <w:pPr>
-        <w:spacing w:before="60" w:after="20" w:line="240" w:lineRule="auto"/>
+        <w:spacing w:before="50" w:after="10" w:line="240" w:lineRule="auto"/>
       </w:pPr>
       <w:r>
         <w:rPr>
@@ -361,9 +334,9 @@
           <w:b/>
           <w:i w:val="0"/>
           <w:color w:val="102C57"/>
-          <w:sz w:val="17"/>
+          <w:sz w:val="16"/>
         </w:rPr>
-        <w:t>3. INTEROPERABILITY</w:t>
+        <w:t>3. INTEROPERABILITY &amp; RESILIENT MICROSERVICES</w:t>
       </w:r>
       <w:r>
         <w:rPr>
@@ -371,7 +344,7 @@
           <w:b w:val="0"/>
           <w:i/>
           <w:color w:val="5A5A5A"/>
-          <w:sz w:val="15"/>
+          <w:sz w:val="14"/>
         </w:rPr>
         <w:t xml:space="preserve">  —  Q: External API integration, protocols, and architectural patterns?</w:t>
       </w:r>
@@ -380,7 +353,7 @@
       <w:pPr>
         <w:pStyle w:val="ListBullet"/>
         <w:spacing w:before="10" w:after="20" w:line="245" w:lineRule="auto"/>
-        <w:ind w:left="288"/>
+        <w:ind w:left="259"/>
       </w:pPr>
       <w:r>
         <w:rPr>
@@ -388,9 +361,9 @@
           <w:b/>
           <w:i w:val="0"/>
           <w:color w:val="191919"/>
-          <w:sz w:val="15"/>
+          <w:sz w:val="14"/>
         </w:rPr>
-        <w:t xml:space="preserve">External REST API Integration &amp; Facade Proxy: </w:t>
+        <w:t xml:space="preserve">External REST API Integration &amp; Facade Reverse-Proxy: </w:t>
       </w:r>
       <w:r>
         <w:rPr>
@@ -398,16 +371,16 @@
           <w:b w:val="0"/>
           <w:i w:val="0"/>
           <w:color w:val="191919"/>
-          <w:sz w:val="15"/>
+          <w:sz w:val="14"/>
         </w:rPr>
-        <w:t>Interoperates with Marc Conrad's Banana microservice (marcconrad.com/uob/banana/api.php?out=json) via a secure backend reverse proxy (bananaController.js), consuming JSON over HTTPS/TLS (port 443) and shielding client browsers from CORS restrictions and DevTools answer inspection.</w:t>
+        <w:t>Consumes Marc Conrad's Banana API (marcconrad.com/uob/banana/api.php?out=json) via a secure backend Express proxy (bananaController.js) over HTTPS/TLS (port 443) using standard JSON serialization.</w:t>
       </w:r>
     </w:p>
     <w:p>
       <w:pPr>
         <w:pStyle w:val="ListBullet"/>
         <w:spacing w:before="10" w:after="20" w:line="245" w:lineRule="auto"/>
-        <w:ind w:left="288"/>
+        <w:ind w:left="259"/>
       </w:pPr>
       <w:r>
         <w:rPr>
@@ -415,7 +388,34 @@
           <w:b/>
           <w:i w:val="0"/>
           <w:color w:val="191919"/>
-          <w:sz w:val="15"/>
+          <w:sz w:val="14"/>
+        </w:rPr>
+        <w:t xml:space="preserve">Anti-Cheat Architectural Barrier: </w:t>
+      </w:r>
+      <w:r>
+        <w:rPr>
+          <w:rFonts w:ascii="Calibri" w:hAnsi="Calibri"/>
+          <w:b w:val="0"/>
+          <w:i w:val="0"/>
+          <w:color w:val="191919"/>
+          <w:sz w:val="14"/>
+        </w:rPr>
+        <w:t>The server extracts data.solution and binds it exclusively to req.session.solution. Only the image URL and queue hints are exposed to the client, preventing browser DevTools inspection or cheat injections.</w:t>
+      </w:r>
+    </w:p>
+    <w:p>
+      <w:pPr>
+        <w:pStyle w:val="ListBullet"/>
+        <w:spacing w:before="10" w:after="20" w:line="245" w:lineRule="auto"/>
+        <w:ind w:left="259"/>
+      </w:pPr>
+      <w:r>
+        <w:rPr>
+          <w:rFonts w:ascii="Calibri" w:hAnsi="Calibri"/>
+          <w:b/>
+          <w:i w:val="0"/>
+          <w:color w:val="191919"/>
+          <w:sz w:val="14"/>
         </w:rPr>
         <w:t xml:space="preserve">Producer-Consumer Pre-Fetch Pool (&lt; 5ms Latency): </w:t>
       </w:r>
@@ -425,16 +425,16 @@
           <w:b w:val="0"/>
           <w:i w:val="0"/>
           <w:color w:val="191919"/>
-          <w:sz w:val="15"/>
+          <w:sz w:val="14"/>
         </w:rPr>
-        <w:t>In-memory buffer (puzzlePool = [], target size: 3) continuously replenished in the background via non-blocking worker threads. Shifting puzzles from server RAM provides instantaneous sub-5ms round transitions paired with preemptive client image pre-caching (nextQuestionHint).</w:t>
+        <w:t>Server maintains an in-memory buffer queue (puzzlePool = [], target size: 3) continuously replenished in the background. Round requests are served from RAM in &lt; 5ms (prefetched: true) and paired with client image pre-caching (new Image().src = data.nextQuestionHint).</w:t>
       </w:r>
     </w:p>
     <w:p>
       <w:pPr>
         <w:pStyle w:val="ListBullet"/>
         <w:spacing w:before="10" w:after="20" w:line="245" w:lineRule="auto"/>
-        <w:ind w:left="288"/>
+        <w:ind w:left="259"/>
       </w:pPr>
       <w:r>
         <w:rPr>
@@ -442,7 +442,7 @@
           <w:b/>
           <w:i w:val="0"/>
           <w:color w:val="191919"/>
-          <w:sz w:val="15"/>
+          <w:sz w:val="14"/>
         </w:rPr>
         <w:t xml:space="preserve">Fault-Tolerant Auto-Failover &amp; Graceful Degradation: </w:t>
       </w:r>
@@ -452,14 +452,14 @@
           <w:b w:val="0"/>
           <w:i w:val="0"/>
           <w:color w:val="191919"/>
-          <w:sz w:val="15"/>
+          <w:sz w:val="14"/>
         </w:rPr>
-        <w:t>Upstream requests are bounded by a strict 2,500ms AbortSignal.timeout barrier. Upon socket drops, DNS failures (ENOTFOUND, ETIMEDOUT), or simulated outages (?simulateOutage=true), the system auto-degrades to an in-memory 12-puzzle offline bank (fallbackPuzzles.js) using non-repeating round-robin rotation (source: 'FALLBACK_CACHE'), guaranteeing 100% High Availability.</w:t>
+        <w:t>Upstream fetches are guarded by an AbortSignal.timeout(2500) barrier. If the live API drops, times out, or simulates an outage (?simulateOutage=true), puzzleService.js catches the fault, logs a console alert, and serves non-repeating puzzles from a 12-puzzle offline bank (source: 'FALLBACK_CACHE'), guaranteeing 100% High Availability.</w:t>
       </w:r>
     </w:p>
     <w:p>
       <w:pPr>
-        <w:spacing w:before="60" w:after="20" w:line="240" w:lineRule="auto"/>
+        <w:spacing w:before="50" w:after="10" w:line="240" w:lineRule="auto"/>
       </w:pPr>
       <w:r>
         <w:rPr>
@@ -467,9 +467,9 @@
           <w:b/>
           <w:i w:val="0"/>
           <w:color w:val="102C57"/>
-          <w:sz w:val="17"/>
+          <w:sz w:val="16"/>
         </w:rPr>
-        <w:t>4. VIRTUAL IDENTITY</w:t>
+        <w:t>4. VIRTUAL IDENTITY &amp; CRYPTOGRAPHIC SECURITY</w:t>
       </w:r>
       <w:r>
         <w:rPr>
@@ -477,7 +477,7 @@
           <w:b w:val="0"/>
           <w:i/>
           <w:color w:val="5A5A5A"/>
-          <w:sz w:val="15"/>
+          <w:sz w:val="14"/>
         </w:rPr>
         <w:t xml:space="preserve">  —  Q: How did you implement virtual identity in your code?</w:t>
       </w:r>
@@ -486,7 +486,7 @@
       <w:pPr>
         <w:pStyle w:val="ListBullet"/>
         <w:spacing w:before="10" w:after="20" w:line="245" w:lineRule="auto"/>
-        <w:ind w:left="288"/>
+        <w:ind w:left="259"/>
       </w:pPr>
       <w:r>
         <w:rPr>
@@ -494,9 +494,9 @@
           <w:b/>
           <w:i w:val="0"/>
           <w:color w:val="191919"/>
-          <w:sz w:val="15"/>
+          <w:sz w:val="14"/>
         </w:rPr>
-        <w:t xml:space="preserve">Cryptographic Hashing (Salted Bcrypt): </w:t>
+        <w:t xml:space="preserve">Cryptographic Key Derivation (Bcrypt): </w:t>
       </w:r>
       <w:r>
         <w:rPr>
@@ -504,16 +504,16 @@
           <w:b w:val="0"/>
           <w:i w:val="0"/>
           <w:color w:val="191919"/>
-          <w:sz w:val="15"/>
+          <w:sz w:val="14"/>
         </w:rPr>
-        <w:t>Plaintext credentials are never saved; authController.js enforces one-way cryptographic derivation using bcryptjs with 10 salt rounds (bcrypt.hash), verified via timing-attack-resistant comparisons (bcrypt.compare).</w:t>
+        <w:t>User passwords never touch disk or memory in plaintext. authController.js enforces one-way hashing with 10 salt rounds (bcrypt.hash), and validates logins using timing-safe comparisons (bcrypt.compare).</w:t>
       </w:r>
     </w:p>
     <w:p>
       <w:pPr>
         <w:pStyle w:val="ListBullet"/>
         <w:spacing w:before="10" w:after="20" w:line="245" w:lineRule="auto"/>
-        <w:ind w:left="288"/>
+        <w:ind w:left="259"/>
       </w:pPr>
       <w:r>
         <w:rPr>
@@ -521,9 +521,9 @@
           <w:b/>
           <w:i w:val="0"/>
           <w:color w:val="191919"/>
-          <w:sz w:val="15"/>
+          <w:sz w:val="14"/>
         </w:rPr>
-        <w:t xml:space="preserve">Stateful HTTP-Only Sessions: </w:t>
+        <w:t xml:space="preserve">Stateful HTTP-Only Session Management: </w:t>
       </w:r>
       <w:r>
         <w:rPr>
@@ -531,16 +531,16 @@
           <w:b w:val="0"/>
           <w:i w:val="0"/>
           <w:color w:val="191919"/>
-          <w:sz w:val="15"/>
+          <w:sz w:val="14"/>
         </w:rPr>
-        <w:t>Authenticated state is maintained via express-session with cryptographically signed HMAC cookie identifiers (connect.sid). Session cookies enforce httpOnly: true (mitigating XSS session hijacking) with a 10-minute sliding window expiration.</w:t>
+        <w:t>Virtual identities are tracked via express-session with cryptographically signed HMAC cookies (connect.sid). Cookies enforce httpOnly: true (mitigating XSS token theft) with a 10-minute sliding expiration window.</w:t>
       </w:r>
     </w:p>
     <w:p>
       <w:pPr>
         <w:pStyle w:val="ListBullet"/>
         <w:spacing w:before="10" w:after="20" w:line="245" w:lineRule="auto"/>
-        <w:ind w:left="288"/>
+        <w:ind w:left="259"/>
       </w:pPr>
       <w:r>
         <w:rPr>
@@ -548,9 +548,9 @@
           <w:b/>
           <w:i w:val="0"/>
           <w:color w:val="191919"/>
-          <w:sz w:val="15"/>
+          <w:sz w:val="14"/>
         </w:rPr>
-        <w:t xml:space="preserve">Relational SQL Persistence &amp; Prepared Queries: </w:t>
+        <w:t xml:space="preserve">Relational Persistence &amp; SQL Injection Defense: </w:t>
       </w:r>
       <w:r>
         <w:rPr>
@@ -558,16 +558,16 @@
           <w:b w:val="0"/>
           <w:i w:val="0"/>
           <w:color w:val="191919"/>
-          <w:sz w:val="15"/>
+          <w:sz w:val="14"/>
         </w:rPr>
-        <w:t>User identities (users table) and player scores (scores table) are permanently persisted in database.sqlite via db.js. All queries use parameterized placeholders (?), providing complete immunity against SQL injection vulnerabilities.</w:t>
+        <w:t>User profiles and scores are stored in SQLite tables (users, scores) via src/models/db.js. Every query strictly utilizes parameterized placeholders (?), providing full immunity against SQL injection attacks.</w:t>
       </w:r>
     </w:p>
     <w:p>
       <w:pPr>
         <w:pStyle w:val="ListBullet"/>
         <w:spacing w:before="10" w:after="20" w:line="245" w:lineRule="auto"/>
-        <w:ind w:left="288"/>
+        <w:ind w:left="259"/>
       </w:pPr>
       <w:r>
         <w:rPr>
@@ -575,7 +575,7 @@
           <w:b/>
           <w:i w:val="0"/>
           <w:color w:val="191919"/>
-          <w:sz w:val="15"/>
+          <w:sz w:val="14"/>
         </w:rPr>
         <w:t xml:space="preserve">Access Control Barrier Middleware (requireAuth): </w:t>
       </w:r>
@@ -585,14 +585,14 @@
           <w:b w:val="0"/>
           <w:i w:val="0"/>
           <w:color w:val="191919"/>
-          <w:sz w:val="15"/>
+          <w:sz w:val="14"/>
         </w:rPr>
-        <w:t>Enforces a deterministic security barrier (authMiddleware.js) intercepting unauthenticated API calls with HTTP 401 Unauthorized and binding game scores strictly to req.session.username.</w:t>
+        <w:t>src/middleware/authMiddleware.js acts as an HTTP 401 gatekeeper across all gameplay and leaderboard routes, binding high scores directly to the verified req.session.username.</w:t>
       </w:r>
     </w:p>
     <w:p>
       <w:pPr>
-        <w:spacing w:before="60" w:after="20" w:line="240" w:lineRule="auto"/>
+        <w:spacing w:before="50" w:after="10" w:line="240" w:lineRule="auto"/>
       </w:pPr>
       <w:r>
         <w:rPr>
@@ -600,9 +600,9 @@
           <w:b/>
           <w:i w:val="0"/>
           <w:color w:val="102C57"/>
-          <w:sz w:val="17"/>
+          <w:sz w:val="16"/>
         </w:rPr>
-        <w:t>5. OTHER INTERESTING FEATURES &amp; ROADMAP</w:t>
+        <w:t>5. ARCHITECTURAL INNOVATIONS &amp; STRATEGIC ROADMAP</w:t>
       </w:r>
       <w:r>
         <w:rPr>
@@ -610,7 +610,7 @@
           <w:b w:val="0"/>
           <w:i/>
           <w:color w:val="5A5A5A"/>
-          <w:sz w:val="15"/>
+          <w:sz w:val="14"/>
         </w:rPr>
         <w:t xml:space="preserve">  —  Q: Key innovations and future scalability plans?</w:t>
       </w:r>
@@ -619,7 +619,7 @@
       <w:pPr>
         <w:pStyle w:val="ListBullet"/>
         <w:spacing w:before="10" w:after="20" w:line="245" w:lineRule="auto"/>
-        <w:ind w:left="288"/>
+        <w:ind w:left="259"/>
       </w:pPr>
       <w:r>
         <w:rPr>
@@ -627,9 +627,9 @@
           <w:b/>
           <w:i w:val="0"/>
           <w:color w:val="191919"/>
-          <w:sz w:val="15"/>
+          <w:sz w:val="14"/>
         </w:rPr>
-        <w:t xml:space="preserve">Cabinet Hardware DIP Switches Modal: </w:t>
+        <w:t xml:space="preserve">Cabinet Hardware DIP Switches Modal &amp; Arcade Juice: </w:t>
       </w:r>
       <w:r>
         <w:rPr>
@@ -637,16 +637,16 @@
           <w:b w:val="0"/>
           <w:i w:val="0"/>
           <w:color w:val="191919"/>
-          <w:sz w:val="15"/>
+          <w:sz w:val="14"/>
         </w:rPr>
-        <w:t>Emulates arcade motherboard DIP switches (#settings-modal) adjusting timer difficulty (Easy 60s, Normal 45s, Hard 20s), CRT scanlines, screen shake VFX, master volume gain, and live/offline API toggle, persisted in localStorage.</w:t>
+        <w:t>Emulates physical cabinet DIP switches (#settings-modal) controlling timer difficulty (Easy 60s, Normal 45s, Hard 20s), CRT scanlines, and screen shake VFX with localStorage persistence; procedural Web Audio synth (audio.js) generates 7 waveforms with dynamic volume scaling.</w:t>
       </w:r>
     </w:p>
     <w:p>
       <w:pPr>
         <w:pStyle w:val="ListBullet"/>
         <w:spacing w:before="10" w:after="20" w:line="245" w:lineRule="auto"/>
-        <w:ind w:left="288"/>
+        <w:ind w:left="259"/>
       </w:pPr>
       <w:r>
         <w:rPr>
@@ -654,9 +654,9 @@
           <w:b/>
           <w:i w:val="0"/>
           <w:color w:val="191919"/>
-          <w:sz w:val="15"/>
+          <w:sz w:val="14"/>
         </w:rPr>
-        <w:t xml:space="preserve">Arcade 'Juice' Feedback Loops &amp; High Scores: </w:t>
+        <w:t xml:space="preserve">Post-Week 8 Scalability Roadmap: </w:t>
       </w:r>
       <w:r>
         <w:rPr>
@@ -664,41 +664,14 @@
           <w:b w:val="0"/>
           <w:i w:val="0"/>
           <w:color w:val="191919"/>
-          <w:sz w:val="15"/>
+          <w:sz w:val="14"/>
         </w:rPr>
-        <w:t>Screen shake, CRT damage/heal flashes, floating score delta popups, and combo streak multipliers (x1, x2, x3); SQL aggregate query (MAX(score)) powers the persistent Hall of Fame marquee.</w:t>
-      </w:r>
-    </w:p>
-    <w:p>
-      <w:pPr>
-        <w:pStyle w:val="ListBullet"/>
-        <w:spacing w:before="10" w:after="20" w:line="245" w:lineRule="auto"/>
-        <w:ind w:left="288"/>
-      </w:pPr>
-      <w:r>
-        <w:rPr>
-          <w:rFonts w:ascii="Calibri" w:hAnsi="Calibri"/>
-          <w:b/>
-          <w:i w:val="0"/>
-          <w:color w:val="191919"/>
-          <w:sz w:val="15"/>
-        </w:rPr>
-        <w:t xml:space="preserve">Strategic Evolution Roadmap: </w:t>
-      </w:r>
-      <w:r>
-        <w:rPr>
-          <w:rFonts w:ascii="Calibri" w:hAnsi="Calibri"/>
-          <w:b w:val="0"/>
-          <w:i w:val="0"/>
-          <w:color w:val="191919"/>
-          <w:sz w:val="15"/>
-        </w:rPr>
-        <w:t>(1) Horizontal container scalability via Redis session clustering; (2) Real-time duplex WebSocket multiplayer (Socket.io); (3) Federated identity via OAuth2/OIDC (Google/GitHub SSO).</w:t>
+        <w:t>(1) Horizontal container scalability via Redis session clustering; (2) Real-time duplex WebSocket multiplayer (Socket.io) for split-screen battles; (3) Federated identity via OAuth2/OIDC (Google/GitHub SSO).</w:t>
       </w:r>
     </w:p>
     <w:sectPr>
       <w:pgSz w:w="11909" w:h="16834"/>
-      <w:pgMar w:top="576" w:right="648" w:bottom="576" w:left="648" w:header="720" w:footer="720" w:gutter="0"/>
+      <w:pgMar w:top="547" w:right="605" w:bottom="547" w:left="605" w:header="720" w:footer="720" w:gutter="0"/>
       <w:cols w:space="720"/>
       <w:docGrid w:linePitch="360"/>
     </w:sectPr>

</xml_diff>

<commit_message>
docs: finalize strictly 1-page signoff form with student ID 2425736 and complete feature coverage
</commit_message>
<xml_diff>
--- a/CIS046-3_Week8_SignOff_Form_Concise.docx
+++ b/CIS046-3_Week8_SignOff_Form_Concise.docx
@@ -13,15 +13,14 @@
           <w:b/>
           <w:i w:val="0"/>
           <w:color w:val="102C57"/>
-          <w:sz w:val="22"/>
+          <w:sz w:val="21"/>
         </w:rPr>
-        <w:t>CIS046-3: Software for Enterprise (AY 26/27) — Week 8 Formal Sign-Off Sheet</w:t>
+        <w:t>CIS046-3 Software for Enterprise – AY 26/27 — Week 8 Final Sign-Off Sheet</w:t>
       </w:r>
     </w:p>
     <w:p>
       <w:pPr>
-        <w:spacing w:before="0" w:after="50"/>
-        <w:jc w:val="center"/>
+        <w:spacing w:before="0" w:after="10" w:line="240" w:lineRule="auto"/>
       </w:pPr>
       <w:r>
         <w:rPr>
@@ -41,8 +40,72 @@
           <w:color w:val="191919"/>
           <w:sz w:val="15"/>
         </w:rPr>
-        <w:t>Lenin Maharjan   |   Student ID: [Your ID]   |   Date: November 2026   |   Sign: ________________________</w:t>
-        <w:br/>
+        <w:t xml:space="preserve">Lenin Maharjan          </w:t>
+      </w:r>
+      <w:r>
+        <w:rPr>
+          <w:rFonts w:ascii="Calibri" w:hAnsi="Calibri"/>
+          <w:b/>
+          <w:i w:val="0"/>
+          <w:color w:val="191919"/>
+          <w:sz w:val="15"/>
+        </w:rPr>
+        <w:t xml:space="preserve">Student Number: </w:t>
+      </w:r>
+      <w:r>
+        <w:rPr>
+          <w:rFonts w:ascii="Calibri" w:hAnsi="Calibri"/>
+          <w:b w:val="0"/>
+          <w:i w:val="0"/>
+          <w:color w:val="191919"/>
+          <w:sz w:val="15"/>
+        </w:rPr>
+        <w:t xml:space="preserve">2425736          </w:t>
+      </w:r>
+      <w:r>
+        <w:rPr>
+          <w:rFonts w:ascii="Calibri" w:hAnsi="Calibri"/>
+          <w:b/>
+          <w:i w:val="0"/>
+          <w:color w:val="191919"/>
+          <w:sz w:val="15"/>
+        </w:rPr>
+        <w:t xml:space="preserve">Date: </w:t>
+      </w:r>
+      <w:r>
+        <w:rPr>
+          <w:rFonts w:ascii="Calibri" w:hAnsi="Calibri"/>
+          <w:b w:val="0"/>
+          <w:i w:val="0"/>
+          <w:color w:val="191919"/>
+          <w:sz w:val="15"/>
+        </w:rPr>
+        <w:t>November 2026 (Week 8)</w:t>
+      </w:r>
+    </w:p>
+    <w:p>
+      <w:pPr>
+        <w:spacing w:before="0" w:after="30" w:line="240" w:lineRule="auto"/>
+      </w:pPr>
+      <w:r>
+        <w:rPr>
+          <w:rFonts w:ascii="Calibri" w:hAnsi="Calibri"/>
+          <w:b/>
+          <w:i w:val="0"/>
+          <w:color w:val="191919"/>
+          <w:sz w:val="15"/>
+        </w:rPr>
+        <w:t xml:space="preserve">Student Signature: </w:t>
+      </w:r>
+      <w:r>
+        <w:rPr>
+          <w:rFonts w:ascii="Calibri" w:hAnsi="Calibri"/>
+          <w:b w:val="0"/>
+          <w:i w:val="0"/>
+          <w:color w:val="191919"/>
+          <w:sz w:val="15"/>
+        </w:rPr>
+        <w:t xml:space="preserve">______________________________     </w:t>
       </w:r>
       <w:r>
         <w:rPr>
@@ -58,31 +121,26 @@
         <w:rPr>
           <w:rFonts w:ascii="Calibri" w:hAnsi="Calibri"/>
           <w:b w:val="0"/>
-          <w:i w:val="0"/>
+          <w:i/>
           <w:color w:val="191919"/>
           <w:sz w:val="15"/>
         </w:rPr>
-        <w:t xml:space="preserve">Banana Quest: 90s Retro Arcade Edition   |   Repo: </w:t>
+        <w:t>Banana Quest: 90s Retro Arcade Edition (github.com/lenin-maharjan/bananaAPI_Quest)</w:t>
       </w:r>
+    </w:p>
+    <w:p>
+      <w:pPr>
+        <w:spacing w:before="0" w:after="50" w:line="240" w:lineRule="auto"/>
+      </w:pPr>
       <w:r>
         <w:rPr>
           <w:rFonts w:ascii="Calibri" w:hAnsi="Calibri"/>
           <w:b w:val="0"/>
           <w:i/>
-          <w:color w:val="191919"/>
-          <w:sz w:val="15"/>
+          <w:color w:val="505050"/>
+          <w:sz w:val="13"/>
         </w:rPr>
-        <w:t xml:space="preserve">github.com/lenin-maharjan/bananaAPI_Quest   |   </w:t>
-      </w:r>
-      <w:r>
-        <w:rPr>
-          <w:rFonts w:ascii="Calibri" w:hAnsi="Calibri"/>
-          <w:b w:val="0"/>
-          <w:i w:val="0"/>
-          <w:color w:val="191919"/>
-          <w:sz w:val="15"/>
-        </w:rPr>
-        <w:t>Stack: Node.js, Express, SQLite, ES6 Modules</w:t>
+        <w:t>Please answer the questions below, print this form and bring it to the presentation where it will be checked against reality and signed off by the tutor. Once signed off, scan this form and submit on BREO with all other deliverables (video, code). At this stage, Week 8, (at least) a working prototype should be presented plus some ideas on how to continue with the development.</w:t>
       </w:r>
     </w:p>
     <w:p>
@@ -97,23 +155,23 @@
           <w:color w:val="102C57"/>
           <w:sz w:val="16"/>
         </w:rPr>
-        <w:t>1. VERSION CONTROL &amp; ARCHITECTURAL EVOLUTION</w:t>
+        <w:t>1. VERSION CONTROL</w:t>
       </w:r>
       <w:r>
         <w:rPr>
           <w:rFonts w:ascii="Calibri" w:hAnsi="Calibri"/>
           <w:b w:val="0"/>
           <w:i/>
-          <w:color w:val="5A5A5A"/>
-          <w:sz w:val="14"/>
+          <w:color w:val="505050"/>
+          <w:sz w:val="13"/>
         </w:rPr>
-        <w:t xml:space="preserve">  —  Q: How did you develop your code (features added after v1.0)?</w:t>
+        <w:t xml:space="preserve">  —  How did you develop your code (e.g., what features have been added after first version)?</w:t>
       </w:r>
     </w:p>
     <w:p>
       <w:pPr>
         <w:pStyle w:val="ListBullet"/>
-        <w:spacing w:before="10" w:after="20" w:line="245" w:lineRule="auto"/>
+        <w:spacing w:before="0" w:after="20" w:line="240" w:lineRule="auto"/>
         <w:ind w:left="259"/>
       </w:pPr>
       <w:r>
@@ -124,7 +182,7 @@
           <w:color w:val="191919"/>
           <w:sz w:val="14"/>
         </w:rPr>
-        <w:t xml:space="preserve">Enterprise Git Flow &amp; Atomic Branching: </w:t>
+        <w:t xml:space="preserve">Enterprise Git Flow &amp; Feature Branching: </w:t>
       </w:r>
       <w:r>
         <w:rPr>
@@ -134,13 +192,13 @@
           <w:color w:val="191919"/>
           <w:sz w:val="14"/>
         </w:rPr>
-        <w:t>Engineered systematically across isolated feature branches (feature/architecture-refactor, feature/robust-identity-sqlite, feature/api-fallback-cache, feature/settings-and-instant-prefetch, feature/fullstack-modular-refactor), merging atomically into main with conventional commits and zero working-tree pollution (.gitignore excludes database.sqlite, node_modules/, and logs).</w:t>
+        <w:t>Developed across isolated feature branches (feature/architecture-refactor, feature/robust-identity-sqlite, feature/api-fallback-cache, feature/settings-and-instant-prefetch, feature/fullstack-modular-refactor), merged atomically into main with zero working-tree pollution (.gitignore excludes database.sqlite, node_modules/, and logs).</w:t>
       </w:r>
     </w:p>
     <w:p>
       <w:pPr>
         <w:pStyle w:val="ListBullet"/>
-        <w:spacing w:before="10" w:after="20" w:line="245" w:lineRule="auto"/>
+        <w:spacing w:before="0" w:after="20" w:line="240" w:lineRule="auto"/>
         <w:ind w:left="259"/>
       </w:pPr>
       <w:r>
@@ -161,13 +219,13 @@
           <w:color w:val="191919"/>
           <w:sz w:val="14"/>
         </w:rPr>
-        <w:t>Decoupled server into specialized layers: a dedicated Service Layer (src/services/puzzleService.js) managing background workers, caching queues, and failover logic; a Config Layer (src/config/fallbackPuzzles.js) storing 12 disaster-recovery assets; thin HTTP controllers (bananaController.js, authController.js); and SQLite relational models (src/models/db.js).</w:t>
+        <w:t>Decoupled server into specialized enterprise tiers: Service Layer (src/services/puzzleService.js) managing background workers, pre-fetch queue, and failover; Config Layer (src/config/fallbackPuzzles.js) storing 12 verified offline recovery puzzles; thin HTTP transport controllers (bananaController.js, authController.js); and SQLite relational models (src/models/db.js).</w:t>
       </w:r>
     </w:p>
     <w:p>
       <w:pPr>
         <w:pStyle w:val="ListBullet"/>
-        <w:spacing w:before="10" w:after="20" w:line="245" w:lineRule="auto"/>
+        <w:spacing w:before="0" w:after="20" w:line="240" w:lineRule="auto"/>
         <w:ind w:left="259"/>
       </w:pPr>
       <w:r>
@@ -188,7 +246,7 @@
           <w:color w:val="191919"/>
           <w:sz w:val="14"/>
         </w:rPr>
-        <w:t>Eliminated client monoliths using native ES6 modules (&lt;script type="module"&gt;), partitioning presentation into single-responsibility domains: audio.js (Web Audio synth), terminal.js (diagnostics), api.js (REST client), ui.js (DOM mutations/HUD), and app.js (orchestrator).</w:t>
+        <w:t>Eliminated client monoliths using native ES6 modules (&lt;script type="module"&gt;), partitioning responsibilities into single-purpose domains: audio.js (Web Audio synth), terminal.js (dual-stream diagnostics), api.js (REST client), ui.js (DOM/HUD mutations), and app.js (orchestrator).</w:t>
       </w:r>
     </w:p>
     <w:p>
@@ -203,23 +261,23 @@
           <w:color w:val="102C57"/>
           <w:sz w:val="16"/>
         </w:rPr>
-        <w:t>2. EVENT-DRIVEN ARCHITECTURES (EDA)</w:t>
+        <w:t>2. EVENT-DRIVEN ARCHITECTURES</w:t>
       </w:r>
       <w:r>
         <w:rPr>
           <w:rFonts w:ascii="Calibri" w:hAnsi="Calibri"/>
           <w:b w:val="0"/>
           <w:i/>
-          <w:color w:val="5A5A5A"/>
-          <w:sz w:val="14"/>
+          <w:color w:val="505050"/>
+          <w:sz w:val="13"/>
         </w:rPr>
-        <w:t xml:space="preserve">  —  Q: What in your code triggers events (GUI, buttons, timeouts)?</w:t>
+        <w:t xml:space="preserve">  —  What in your code triggers events (e.g., GUI, buttons, timeout …)?</w:t>
       </w:r>
     </w:p>
     <w:p>
       <w:pPr>
         <w:pStyle w:val="ListBullet"/>
-        <w:spacing w:before="10" w:after="20" w:line="245" w:lineRule="auto"/>
+        <w:spacing w:before="0" w:after="20" w:line="240" w:lineRule="auto"/>
         <w:ind w:left="259"/>
       </w:pPr>
       <w:r>
@@ -240,13 +298,13 @@
           <w:color w:val="191919"/>
           <w:sz w:val="14"/>
         </w:rPr>
-        <w:t>Domain modules communicate purely asynchronously through an in-browser CustomEvent bus (auth-success, puzzle-loaded, guess-evaluated, streak-updated, score-saved, game-over, sfx-toggled, settings-updated), eliminating direct DOM and component coupling.</w:t>
+        <w:t>Components interact asynchronously via a CustomEvent bus (auth-success, puzzle-loaded, guess-evaluated, streak-updated, score-saved, game-over, sfx-toggled, settings-updated), eliminating direct DOM and component coupling.</w:t>
       </w:r>
     </w:p>
     <w:p>
       <w:pPr>
         <w:pStyle w:val="ListBullet"/>
-        <w:spacing w:before="10" w:after="20" w:line="245" w:lineRule="auto"/>
+        <w:spacing w:before="0" w:after="20" w:line="240" w:lineRule="auto"/>
         <w:ind w:left="259"/>
       </w:pPr>
       <w:r>
@@ -267,13 +325,13 @@
           <w:color w:val="191919"/>
           <w:sz w:val="14"/>
         </w:rPr>
-        <w:t>Runtime faults and wrong guesses initiate a non-blocking 3-second self-healing interval (setTimeout(() =&gt; loadPuzzle(), 3000)), halting countdown timers and disabling inputs to prevent race conditions and input spamming while auto-advancing rounds.</w:t>
+        <w:t>Runtime faults and wrong guesses initiate a non-blocking 3-second self-healing delay (setTimeout(() =&gt; loadPuzzle(), 3000)), pausing game countdowns and disabling keypad/keyboard inputs to prevent race conditions and input spamming while auto-advancing rounds.</w:t>
       </w:r>
     </w:p>
     <w:p>
       <w:pPr>
         <w:pStyle w:val="ListBullet"/>
-        <w:spacing w:before="10" w:after="20" w:line="245" w:lineRule="auto"/>
+        <w:spacing w:before="0" w:after="20" w:line="240" w:lineRule="auto"/>
         <w:ind w:left="259"/>
       </w:pPr>
       <w:r>
@@ -294,13 +352,13 @@
           <w:color w:val="191919"/>
           <w:sz w:val="14"/>
         </w:rPr>
-        <w:t>Real-time MS-DOS diagnostic console split into an Event Bus observer stream (logToEventStream -&gt; EVENT_BUS.EXE) and an automated fault interceptor (logToErrorStream -&gt; ERROR_LOG.DAT) capturing network drops, timeouts, and wrong answers with millisecond timestamps (HH:MM:SS.mmm).</w:t>
+        <w:t>Real-time MS-DOS diagnostic console split into an Event Bus stream (logToEventStream -&gt; EVENT_BUS.EXE) observing custom events, and an automated fault interceptor (logToErrorStream -&gt; ERROR_LOG.DAT) capturing HTTP drops, countdown timeouts, and exceptions with millisecond timestamps.</w:t>
       </w:r>
     </w:p>
     <w:p>
       <w:pPr>
         <w:pStyle w:val="ListBullet"/>
-        <w:spacing w:before="10" w:after="20" w:line="245" w:lineRule="auto"/>
+        <w:spacing w:before="0" w:after="20" w:line="240" w:lineRule="auto"/>
         <w:ind w:left="259"/>
       </w:pPr>
       <w:r>
@@ -311,7 +369,7 @@
           <w:color w:val="191919"/>
           <w:sz w:val="14"/>
         </w:rPr>
-        <w:t xml:space="preserve">Hardware Interrupts &amp; Procedural Web Audio Synth: </w:t>
+        <w:t xml:space="preserve">Hardware &amp; Temporal Event Triggers: </w:t>
       </w:r>
       <w:r>
         <w:rPr>
@@ -321,7 +379,7 @@
           <w:color w:val="191919"/>
           <w:sz w:val="14"/>
         </w:rPr>
-        <w:t>Captures physical keyboard interrupts (keypad 0-9 auto-submit, 'F' outage toggle) and temporal intervals (setInterval 1s countdown with &lt;10s panic mode thresholding); procedurally synthesizes dynamic 8-bit sound waveforms via AudioContext.</w:t>
+        <w:t>Captures physical keyboard interrupts (keypad 0-9 auto-submit, 'F' outage toggle), temporal intervals (setInterval 1s tick with &lt;10s panic mode visual pulsing and warning ticks), and GUI DIP switches to dynamically trigger procedural sound synthesis.</w:t>
       </w:r>
     </w:p>
     <w:p>
@@ -336,23 +394,23 @@
           <w:color w:val="102C57"/>
           <w:sz w:val="16"/>
         </w:rPr>
-        <w:t>3. INTEROPERABILITY &amp; RESILIENT MICROSERVICES</w:t>
+        <w:t>3. INTEROPERABILITY</w:t>
       </w:r>
       <w:r>
         <w:rPr>
           <w:rFonts w:ascii="Calibri" w:hAnsi="Calibri"/>
           <w:b w:val="0"/>
           <w:i/>
-          <w:color w:val="5A5A5A"/>
-          <w:sz w:val="14"/>
+          <w:color w:val="505050"/>
+          <w:sz w:val="13"/>
         </w:rPr>
-        <w:t xml:space="preserve">  —  Q: External API integration, protocols, and architectural patterns?</w:t>
+        <w:t xml:space="preserve">  —  Do you use the API https://marcconrad.com/uob/tomato/api.php? If no, where do you demonstrate interoperability? Protocols?</w:t>
       </w:r>
     </w:p>
     <w:p>
       <w:pPr>
         <w:pStyle w:val="ListBullet"/>
-        <w:spacing w:before="10" w:after="20" w:line="245" w:lineRule="auto"/>
+        <w:spacing w:before="0" w:after="20" w:line="240" w:lineRule="auto"/>
         <w:ind w:left="259"/>
       </w:pPr>
       <w:r>
@@ -373,13 +431,13 @@
           <w:color w:val="191919"/>
           <w:sz w:val="14"/>
         </w:rPr>
-        <w:t>Consumes Marc Conrad's Banana API (marcconrad.com/uob/banana/api.php?out=json) via a secure backend Express proxy (bananaController.js) over HTTPS/TLS (port 443) using standard JSON serialization.</w:t>
+        <w:t>Consumes Marc Conrad's Banana API microservice (marcconrad.com/uob/banana/api.php?out=json) via a secure backend Express proxy (bananaController.js) over HTTPS/TLS (port 443) using standard JSON serialization.</w:t>
       </w:r>
     </w:p>
     <w:p>
       <w:pPr>
         <w:pStyle w:val="ListBullet"/>
-        <w:spacing w:before="10" w:after="20" w:line="245" w:lineRule="auto"/>
+        <w:spacing w:before="0" w:after="20" w:line="240" w:lineRule="auto"/>
         <w:ind w:left="259"/>
       </w:pPr>
       <w:r>
@@ -406,7 +464,7 @@
     <w:p>
       <w:pPr>
         <w:pStyle w:val="ListBullet"/>
-        <w:spacing w:before="10" w:after="20" w:line="245" w:lineRule="auto"/>
+        <w:spacing w:before="0" w:after="20" w:line="240" w:lineRule="auto"/>
         <w:ind w:left="259"/>
       </w:pPr>
       <w:r>
@@ -433,7 +491,7 @@
     <w:p>
       <w:pPr>
         <w:pStyle w:val="ListBullet"/>
-        <w:spacing w:before="10" w:after="20" w:line="245" w:lineRule="auto"/>
+        <w:spacing w:before="0" w:after="20" w:line="240" w:lineRule="auto"/>
         <w:ind w:left="259"/>
       </w:pPr>
       <w:r>
@@ -444,7 +502,7 @@
           <w:color w:val="191919"/>
           <w:sz w:val="14"/>
         </w:rPr>
-        <w:t xml:space="preserve">Fault-Tolerant Auto-Failover &amp; Graceful Degradation: </w:t>
+        <w:t xml:space="preserve">Fault-Tolerant Auto-Failover &amp; Live Health Indicator: </w:t>
       </w:r>
       <w:r>
         <w:rPr>
@@ -454,7 +512,7 @@
           <w:color w:val="191919"/>
           <w:sz w:val="14"/>
         </w:rPr>
-        <w:t>Upstream fetches are guarded by an AbortSignal.timeout(2500) barrier. If the live API drops, times out, or simulates an outage (?simulateOutage=true), puzzleService.js catches the fault, logs a console alert, and serves non-repeating puzzles from a 12-puzzle offline bank (source: 'FALLBACK_CACHE'), guaranteeing 100% High Availability.</w:t>
+        <w:t>Upstream requests are guarded by an AbortSignal.timeout(2500) barrier. On socket drops, network drops, or simulated outages (?simulateOutage=true or 'F' key), puzzleService.js auto-fails over to a 12-puzzle offline cache (source: 'FALLBACK_CACHE') and updates the HUD status pill ([🟢 LIVE API] vs [🟠 OFFLINE CACHE]).</w:t>
       </w:r>
     </w:p>
     <w:p>
@@ -469,23 +527,23 @@
           <w:color w:val="102C57"/>
           <w:sz w:val="16"/>
         </w:rPr>
-        <w:t>4. VIRTUAL IDENTITY &amp; CRYPTOGRAPHIC SECURITY</w:t>
+        <w:t>4. VIRTUAL IDENTITY</w:t>
       </w:r>
       <w:r>
         <w:rPr>
           <w:rFonts w:ascii="Calibri" w:hAnsi="Calibri"/>
           <w:b w:val="0"/>
           <w:i/>
-          <w:color w:val="5A5A5A"/>
-          <w:sz w:val="14"/>
+          <w:color w:val="505050"/>
+          <w:sz w:val="13"/>
         </w:rPr>
-        <w:t xml:space="preserve">  —  Q: How did you implement virtual identity in your code?</w:t>
+        <w:t xml:space="preserve">  —  How did you implement virtual identity in your code? (e.g., Passwords, Cookies, IP Numbers …)</w:t>
       </w:r>
     </w:p>
     <w:p>
       <w:pPr>
         <w:pStyle w:val="ListBullet"/>
-        <w:spacing w:before="10" w:after="20" w:line="245" w:lineRule="auto"/>
+        <w:spacing w:before="0" w:after="20" w:line="240" w:lineRule="auto"/>
         <w:ind w:left="259"/>
       </w:pPr>
       <w:r>
@@ -506,13 +564,13 @@
           <w:color w:val="191919"/>
           <w:sz w:val="14"/>
         </w:rPr>
-        <w:t>User passwords never touch disk or memory in plaintext. authController.js enforces one-way hashing with 10 salt rounds (bcrypt.hash), and validates logins using timing-safe comparisons (bcrypt.compare).</w:t>
+        <w:t>User passwords never touch disk or memory in plaintext. authController.js enforces one-way cryptographic derivation using bcryptjs with 10 salt rounds (bcrypt.hash), and validates logins using timing-attack-resistant comparisons (bcrypt.compare).</w:t>
       </w:r>
     </w:p>
     <w:p>
       <w:pPr>
         <w:pStyle w:val="ListBullet"/>
-        <w:spacing w:before="10" w:after="20" w:line="245" w:lineRule="auto"/>
+        <w:spacing w:before="0" w:after="20" w:line="240" w:lineRule="auto"/>
         <w:ind w:left="259"/>
       </w:pPr>
       <w:r>
@@ -539,7 +597,7 @@
     <w:p>
       <w:pPr>
         <w:pStyle w:val="ListBullet"/>
-        <w:spacing w:before="10" w:after="20" w:line="245" w:lineRule="auto"/>
+        <w:spacing w:before="0" w:after="20" w:line="240" w:lineRule="auto"/>
         <w:ind w:left="259"/>
       </w:pPr>
       <w:r>
@@ -560,13 +618,13 @@
           <w:color w:val="191919"/>
           <w:sz w:val="14"/>
         </w:rPr>
-        <w:t>User profiles and scores are stored in SQLite tables (users, scores) via src/models/db.js. Every query strictly utilizes parameterized placeholders (?), providing full immunity against SQL injection attacks.</w:t>
+        <w:t>User credentials and high scores are permanently stored in SQLite tables (users, scores) via src/models/db.js. Every query strictly utilizes parameterized prepared statements (?), providing full immunity against SQL injection vulnerabilities.</w:t>
       </w:r>
     </w:p>
     <w:p>
       <w:pPr>
         <w:pStyle w:val="ListBullet"/>
-        <w:spacing w:before="10" w:after="20" w:line="245" w:lineRule="auto"/>
+        <w:spacing w:before="0" w:after="20" w:line="240" w:lineRule="auto"/>
         <w:ind w:left="259"/>
       </w:pPr>
       <w:r>
@@ -587,7 +645,7 @@
           <w:color w:val="191919"/>
           <w:sz w:val="14"/>
         </w:rPr>
-        <w:t>src/middleware/authMiddleware.js acts as an HTTP 401 gatekeeper across all gameplay and leaderboard routes, binding high scores directly to the verified req.session.username.</w:t>
+        <w:t>src/middleware/authMiddleware.js halts unauthenticated requests with HTTP 401 Unauthorized across all game endpoints, binding player scores directly to the verified req.session.username preventing score spoofing.</w:t>
       </w:r>
     </w:p>
     <w:p>
@@ -602,23 +660,23 @@
           <w:color w:val="102C57"/>
           <w:sz w:val="16"/>
         </w:rPr>
-        <w:t>5. ARCHITECTURAL INNOVATIONS &amp; STRATEGIC ROADMAP</w:t>
+        <w:t>5. OTHER INTERESTING FEATURES &amp; POST-WEEK 8 IDEAS</w:t>
       </w:r>
       <w:r>
         <w:rPr>
           <w:rFonts w:ascii="Calibri" w:hAnsi="Calibri"/>
           <w:b w:val="0"/>
           <w:i/>
-          <w:color w:val="5A5A5A"/>
-          <w:sz w:val="14"/>
+          <w:color w:val="505050"/>
+          <w:sz w:val="13"/>
         </w:rPr>
-        <w:t xml:space="preserve">  —  Q: Key innovations and future scalability plans?</w:t>
+        <w:t xml:space="preserve">  —  Any other interesting features (plus ideas on how to continue development)?</w:t>
       </w:r>
     </w:p>
     <w:p>
       <w:pPr>
         <w:pStyle w:val="ListBullet"/>
-        <w:spacing w:before="10" w:after="20" w:line="245" w:lineRule="auto"/>
+        <w:spacing w:before="0" w:after="20" w:line="240" w:lineRule="auto"/>
         <w:ind w:left="259"/>
       </w:pPr>
       <w:r>
@@ -629,7 +687,7 @@
           <w:color w:val="191919"/>
           <w:sz w:val="14"/>
         </w:rPr>
-        <w:t xml:space="preserve">Cabinet Hardware DIP Switches Modal &amp; Arcade Juice: </w:t>
+        <w:t xml:space="preserve">Procedural 8-Bit Synthesizer &amp; Hardware DIP Switches: </w:t>
       </w:r>
       <w:r>
         <w:rPr>
@@ -639,13 +697,13 @@
           <w:color w:val="191919"/>
           <w:sz w:val="14"/>
         </w:rPr>
-        <w:t>Emulates physical cabinet DIP switches (#settings-modal) controlling timer difficulty (Easy 60s, Normal 45s, Hard 20s), CRT scanlines, and screen shake VFX with localStorage persistence; procedural Web Audio synth (audio.js) generates 7 waveforms with dynamic volume scaling.</w:t>
+        <w:t>Zero external audio files; audio.js procedurally synthesizes 7 authentic waveforms (square/triangle/sawtooth) with master volume gain scaling; #settings-modal emulates arcade motherboard DIP switches controlling difficulty, CRT scanlines, and VFX shake with localStorage persistence.</w:t>
       </w:r>
     </w:p>
     <w:p>
       <w:pPr>
         <w:pStyle w:val="ListBullet"/>
-        <w:spacing w:before="10" w:after="20" w:line="245" w:lineRule="auto"/>
+        <w:spacing w:before="0" w:after="20" w:line="240" w:lineRule="auto"/>
         <w:ind w:left="259"/>
       </w:pPr>
       <w:r>
@@ -656,7 +714,34 @@
           <w:color w:val="191919"/>
           <w:sz w:val="14"/>
         </w:rPr>
-        <w:t xml:space="preserve">Post-Week 8 Scalability Roadmap: </w:t>
+        <w:t xml:space="preserve">Arcade Juice &amp; Persistent Hall of Fame: </w:t>
+      </w:r>
+      <w:r>
+        <w:rPr>
+          <w:rFonts w:ascii="Calibri" w:hAnsi="Calibri"/>
+          <w:b w:val="0"/>
+          <w:i w:val="0"/>
+          <w:color w:val="191919"/>
+          <w:sz w:val="14"/>
+        </w:rPr>
+        <w:t>Camera shake, CRT damage/heal flashes, floating +PTS popups, and combo streak multipliers (x1, x2, x3 ON FIRE!); SQL aggregate query (MAX(score)) powers the live marquee High Score tracker.</w:t>
+      </w:r>
+    </w:p>
+    <w:p>
+      <w:pPr>
+        <w:pStyle w:val="ListBullet"/>
+        <w:spacing w:before="0" w:after="20" w:line="240" w:lineRule="auto"/>
+        <w:ind w:left="259"/>
+      </w:pPr>
+      <w:r>
+        <w:rPr>
+          <w:rFonts w:ascii="Calibri" w:hAnsi="Calibri"/>
+          <w:b/>
+          <w:i w:val="0"/>
+          <w:color w:val="191919"/>
+          <w:sz w:val="14"/>
+        </w:rPr>
+        <w:t xml:space="preserve">Strategic Evolution Roadmap: </w:t>
       </w:r>
       <w:r>
         <w:rPr>
@@ -671,7 +756,7 @@
     </w:p>
     <w:sectPr>
       <w:pgSz w:w="11909" w:h="16834"/>
-      <w:pgMar w:top="547" w:right="605" w:bottom="547" w:left="605" w:header="720" w:footer="720" w:gutter="0"/>
+      <w:pgMar w:top="504" w:right="576" w:bottom="504" w:left="576" w:header="720" w:footer="720" w:gutter="0"/>
       <w:cols w:space="720"/>
       <w:docGrid w:linePitch="360"/>
     </w:sectPr>

</xml_diff>